<commit_message>
Please dear god be done
</commit_message>
<xml_diff>
--- a/Entries/Warped Tour.docx
+++ b/Entries/Warped Tour.docx
@@ -6,11 +6,9 @@
       <w:r>
         <w:t xml:space="preserve"> I can still remember the first time I crossed that threshold into the swarming crowd misfits and misunderstood. The hot asphalt radiating with more heat than any </w:t>
       </w:r>
-      <w:proofErr w:type="gramStart"/>
-      <w:r>
-        <w:t>15 year old</w:t>
-      </w:r>
-      <w:proofErr w:type="gramEnd"/>
+      <w:r>
+        <w:t>15-year-old</w:t>
+      </w:r>
       <w:r>
         <w:t xml:space="preserve"> should have to bear. The smell of sunscreen and, if we’re being truthful, BO filled the air. As I rounded the corner to the first stage a familiar tune blared louder than I have ever heard before. “Tell me what you </w:t>
       </w:r>
@@ -805,6 +803,7 @@
   <w:style w:type="character" w:default="1" w:styleId="DefaultParagraphFont">
     <w:name w:val="Default Paragraph Font"/>
     <w:uiPriority w:val="1"/>
+    <w:semiHidden/>
     <w:unhideWhenUsed/>
   </w:style>
   <w:style w:type="table" w:default="1" w:styleId="TableNormal">

</xml_diff>